<commit_message>
Codigo de diagramas junto al dibujo que produce en Arquitectura, BD II y Seminario; codigo sin lineas partidas en los cinco cursos
Co-Authored-By: Claude Opus 5.5 <noreply@anthropic.com>
</commit_message>
<xml_diff>
--- a/Arquitectura de Sistemas Computacionales/Kit docente/Clase 7/Guion Docente Clase 7 - Redes y almacenamiento cloud.docx
+++ b/Arquitectura de Sistemas Computacionales/Kit docente/Clase 7/Guion Docente Clase 7 - Redes y almacenamiento cloud.docx
@@ -1242,7 +1242,7 @@
           <w:color w:val="4A4A49"/>
           <w:sz w:val="22"/>
         </w:rPr>
-        <w:t xml:space="preserve"> — 6 vinetas.</w:t>
+        <w:t xml:space="preserve"> — 8 vinetas.</w:t>
       </w:r>
     </w:p>
     <w:p>
@@ -2143,7 +2143,7 @@
           <w:color w:val="4A4A49"/>
           <w:sz w:val="22"/>
         </w:rPr>
-        <w:t xml:space="preserve"> — 15 vinetas.</w:t>
+        <w:t xml:space="preserve"> — 16 vinetas.</w:t>
       </w:r>
     </w:p>
     <w:p>

</xml_diff>